<commit_message>
Improvements to Geography and Date Dimensions
Additional Geography fields for PENN introduced and tested in new offline dataset. Also additional fields for MACROHISTORY but some further (analytical) work required to deal with series gaps.
</commit_message>
<xml_diff>
--- a/SETUP/Readme.docx
+++ b/SETUP/Readme.docx
@@ -1,6 +1,6 @@
 
 <file path=word/document.xml><?xml version="1.0" encoding="utf-8"?>
-<w:document xmlns:wpc="http://schemas.microsoft.com/office/word/2010/wordprocessingCanvas" xmlns:cx="http://schemas.microsoft.com/office/drawing/2014/chartex" xmlns:cx1="http://schemas.microsoft.com/office/drawing/2015/9/8/chartex" xmlns:cx2="http://schemas.microsoft.com/office/drawing/2015/10/21/chartex" xmlns:cx3="http://schemas.microsoft.com/office/drawing/2016/5/9/chartex" xmlns:cx4="http://schemas.microsoft.com/office/drawing/2016/5/10/chartex" xmlns:cx5="http://schemas.microsoft.com/office/drawing/2016/5/11/chartex" xmlns:cx6="http://schemas.microsoft.com/office/drawing/2016/5/12/chartex" xmlns:cx7="http://schemas.microsoft.com/office/drawing/2016/5/13/chartex" xmlns:cx8="http://schemas.microsoft.com/office/drawing/2016/5/14/chartex" xmlns:mc="http://schemas.openxmlformats.org/markup-compatibility/2006" xmlns:aink="http://schemas.microsoft.com/office/drawing/2016/ink" xmlns:am3d="http://schemas.microsoft.com/office/drawing/2017/model3d" xmlns:o="urn:schemas-microsoft-com:office:office" xmlns:r="http://schemas.openxmlformats.org/officeDocument/2006/relationships" xmlns:m="http://schemas.openxmlformats.org/officeDocument/2006/math" xmlns:v="urn:schemas-microsoft-com:vml" xmlns:wp14="http://schemas.microsoft.com/office/word/2010/wordprocessingDrawing" xmlns:wp="http://schemas.openxmlformats.org/drawingml/2006/wordprocessingDrawing" xmlns:w10="urn:schemas-microsoft-com:office:word" xmlns:w="http://schemas.openxmlformats.org/wordprocessingml/2006/main" xmlns:w14="http://schemas.microsoft.com/office/word/2010/wordml" xmlns:w15="http://schemas.microsoft.com/office/word/2012/wordml" xmlns:w16cid="http://schemas.microsoft.com/office/word/2016/wordml/cid" xmlns:w16se="http://schemas.microsoft.com/office/word/2015/wordml/symex" xmlns:wpg="http://schemas.microsoft.com/office/word/2010/wordprocessingGroup" xmlns:wpi="http://schemas.microsoft.com/office/word/2010/wordprocessingInk" xmlns:wne="http://schemas.microsoft.com/office/word/2006/wordml" xmlns:wps="http://schemas.microsoft.com/office/word/2010/wordprocessingShape" mc:Ignorable="w14 w15 w16se w16cid wp14">
+<w:document xmlns:wpc="http://schemas.microsoft.com/office/word/2010/wordprocessingCanvas" xmlns:cx="http://schemas.microsoft.com/office/drawing/2014/chartex" xmlns:cx1="http://schemas.microsoft.com/office/drawing/2015/9/8/chartex" xmlns:mc="http://schemas.openxmlformats.org/markup-compatibility/2006" xmlns:o="urn:schemas-microsoft-com:office:office" xmlns:r="http://schemas.openxmlformats.org/officeDocument/2006/relationships" xmlns:m="http://schemas.openxmlformats.org/officeDocument/2006/math" xmlns:v="urn:schemas-microsoft-com:vml" xmlns:wp14="http://schemas.microsoft.com/office/word/2010/wordprocessingDrawing" xmlns:wp="http://schemas.openxmlformats.org/drawingml/2006/wordprocessingDrawing" xmlns:w10="urn:schemas-microsoft-com:office:word" xmlns:w="http://schemas.openxmlformats.org/wordprocessingml/2006/main" xmlns:w14="http://schemas.microsoft.com/office/word/2010/wordml" xmlns:w15="http://schemas.microsoft.com/office/word/2012/wordml" xmlns:w16se="http://schemas.microsoft.com/office/word/2015/wordml/symex" xmlns:wpg="http://schemas.microsoft.com/office/word/2010/wordprocessingGroup" xmlns:wpi="http://schemas.microsoft.com/office/word/2010/wordprocessingInk" xmlns:wne="http://schemas.microsoft.com/office/word/2006/wordml" xmlns:wps="http://schemas.microsoft.com/office/word/2010/wordprocessingShape" mc:Ignorable="w14 w15 w16se wp14">
   <w:body>
     <w:p>
       <w:pPr>
@@ -9,11 +9,184 @@
           <w:lang w:val="en-GB"/>
         </w:rPr>
       </w:pPr>
-      <w:r>
-        <w:rPr>
-          <w:lang w:val="en-GB"/>
-        </w:rPr>
-        <w:t>Setup files</w:t>
+      <w:bookmarkStart w:id="0" w:name="_GoBack"/>
+      <w:bookmarkEnd w:id="0"/>
+      <w:r>
+        <w:rPr>
+          <w:lang w:val="en-GB"/>
+        </w:rPr>
+        <w:t>NOTE (2 December 2019)</w:t>
+      </w:r>
+    </w:p>
+    <w:p>
+      <w:pPr>
+        <w:rPr>
+          <w:lang w:val="en-GB"/>
+        </w:rPr>
+      </w:pPr>
+      <w:r>
+        <w:rPr>
+          <w:lang w:val="en-GB"/>
+        </w:rPr>
+        <w:t>Beyond this section is now slightly outdated because I’ve split the parts of the project which create a server from those which create an offline dataset. Essentially, an offline dataset is all you really need unless you want to work on developing the project, which you are very welcome to do. But I have kept these notes as a basis for a future rewrite concentrating on the server-side work. I assume however that if you want to work on the server-side stuff, you are already pretty familiar with how this all works. So all you really need to do is</w:t>
+      </w:r>
+    </w:p>
+    <w:p>
+      <w:pPr>
+        <w:pStyle w:val="ListParagraph"/>
+        <w:numPr>
+          <w:ilvl w:val="0"/>
+          <w:numId w:val="4"/>
+        </w:numPr>
+        <w:rPr>
+          <w:lang w:val="en-GB"/>
+        </w:rPr>
+      </w:pPr>
+      <w:r>
+        <w:rPr>
+          <w:lang w:val="en-GB"/>
+        </w:rPr>
+        <w:t>Install SQL server somewhere (2016 or later)</w:t>
+      </w:r>
+    </w:p>
+    <w:p>
+      <w:pPr>
+        <w:pStyle w:val="ListParagraph"/>
+        <w:numPr>
+          <w:ilvl w:val="0"/>
+          <w:numId w:val="4"/>
+        </w:numPr>
+        <w:rPr>
+          <w:lang w:val="en-GB"/>
+        </w:rPr>
+      </w:pPr>
+      <w:r>
+        <w:rPr>
+          <w:lang w:val="en-GB"/>
+        </w:rPr>
+        <w:t>Create two databases called OLTP and ROLAP</w:t>
+      </w:r>
+    </w:p>
+    <w:p>
+      <w:pPr>
+        <w:pStyle w:val="ListParagraph"/>
+        <w:numPr>
+          <w:ilvl w:val="0"/>
+          <w:numId w:val="4"/>
+        </w:numPr>
+        <w:rPr>
+          <w:lang w:val="en-GB"/>
+        </w:rPr>
+      </w:pPr>
+      <w:r>
+        <w:rPr>
+          <w:lang w:val="en-GB"/>
+        </w:rPr>
+        <w:t>Install and run Visual Studio with SSIS management tools included as an extension</w:t>
+      </w:r>
+    </w:p>
+    <w:p>
+      <w:pPr>
+        <w:pStyle w:val="ListParagraph"/>
+        <w:numPr>
+          <w:ilvl w:val="0"/>
+          <w:numId w:val="4"/>
+        </w:numPr>
+        <w:rPr>
+          <w:lang w:val="en-GB"/>
+        </w:rPr>
+      </w:pPr>
+      <w:r>
+        <w:rPr>
+          <w:lang w:val="en-GB"/>
+        </w:rPr>
+        <w:t>Open macrohistory.sln</w:t>
+      </w:r>
+    </w:p>
+    <w:p>
+      <w:pPr>
+        <w:pStyle w:val="ListParagraph"/>
+        <w:numPr>
+          <w:ilvl w:val="0"/>
+          <w:numId w:val="4"/>
+        </w:numPr>
+        <w:rPr>
+          <w:lang w:val="en-GB"/>
+        </w:rPr>
+      </w:pPr>
+      <w:r>
+        <w:rPr>
+          <w:lang w:val="en-GB"/>
+        </w:rPr>
+        <w:t>Run the packages in the following order:</w:t>
+      </w:r>
+    </w:p>
+    <w:p>
+      <w:pPr>
+        <w:pStyle w:val="ListParagraph"/>
+        <w:numPr>
+          <w:ilvl w:val="1"/>
+          <w:numId w:val="4"/>
+        </w:numPr>
+        <w:rPr>
+          <w:lang w:val="en-GB"/>
+        </w:rPr>
+      </w:pPr>
+      <w:r>
+        <w:rPr>
+          <w:lang w:val="en-GB"/>
+        </w:rPr>
+        <w:t>OLTP setup</w:t>
+      </w:r>
+    </w:p>
+    <w:p>
+      <w:pPr>
+        <w:pStyle w:val="ListParagraph"/>
+        <w:numPr>
+          <w:ilvl w:val="1"/>
+          <w:numId w:val="4"/>
+        </w:numPr>
+        <w:rPr>
+          <w:lang w:val="en-GB"/>
+        </w:rPr>
+      </w:pPr>
+      <w:r>
+        <w:rPr>
+          <w:lang w:val="en-GB"/>
+        </w:rPr>
+        <w:t>OLTP import</w:t>
+      </w:r>
+    </w:p>
+    <w:p>
+      <w:pPr>
+        <w:pStyle w:val="ListParagraph"/>
+        <w:numPr>
+          <w:ilvl w:val="1"/>
+          <w:numId w:val="4"/>
+        </w:numPr>
+        <w:rPr>
+          <w:lang w:val="en-GB"/>
+        </w:rPr>
+      </w:pPr>
+      <w:r>
+        <w:rPr>
+          <w:lang w:val="en-GB"/>
+        </w:rPr>
+        <w:t>ROLAP setup</w:t>
+      </w:r>
+    </w:p>
+    <w:p>
+      <w:pPr>
+        <w:pStyle w:val="Heading1"/>
+        <w:rPr>
+          <w:lang w:val="en-GB"/>
+        </w:rPr>
+      </w:pPr>
+      <w:r>
+        <w:rPr>
+          <w:lang w:val="en-GB"/>
+        </w:rPr>
+        <w:t>Old documentation</w:t>
       </w:r>
     </w:p>
     <w:p>
@@ -38,7 +211,31 @@
         <w:rPr>
           <w:lang w:val="en-GB"/>
         </w:rPr>
-        <w:t xml:space="preserve"> are sufficient to create a copy of the dataset on an SQL Server instance, which can either be remote (either on a cloud server or a university or enterprise server that can be accessed externally) or local, for example on your desktop or laptop. The Developer edition of SQL server is now free</w:t>
+        <w:t xml:space="preserve"> are sufficient to create a copy of the dataset on an SQL Server instance, which can either be remote (</w:t>
+      </w:r>
+      <w:r>
+        <w:rPr>
+          <w:lang w:val="en-GB"/>
+        </w:rPr>
+        <w:t>such as a</w:t>
+      </w:r>
+      <w:r>
+        <w:rPr>
+          <w:lang w:val="en-GB"/>
+        </w:rPr>
+        <w:t xml:space="preserve"> cloud </w:t>
+      </w:r>
+      <w:r>
+        <w:rPr>
+          <w:lang w:val="en-GB"/>
+        </w:rPr>
+        <w:t xml:space="preserve">or enterprise </w:t>
+      </w:r>
+      <w:r>
+        <w:rPr>
+          <w:lang w:val="en-GB"/>
+        </w:rPr>
+        <w:t>server) or local, for example on your desktop or laptop. The Developer edition of SQL server is now free</w:t>
       </w:r>
       <w:r>
         <w:rPr>
@@ -202,6 +399,7 @@
               <w:spacing w:after="0" w:line="240" w:lineRule="auto"/>
             </w:pPr>
             <w:r>
+              <w:lastRenderedPageBreak/>
               <w:t>Fact.csv</w:t>
             </w:r>
           </w:p>
@@ -513,7 +711,6 @@
     </w:p>
     <w:p>
       <w:r>
-        <w:lastRenderedPageBreak/>
         <w:t>This procedure creates tables with the format expected by the data model. Once the tables are created, you can upload the data into them.</w:t>
       </w:r>
     </w:p>
@@ -743,6 +940,7 @@
         <w:rPr>
           <w:lang w:val="en-GB"/>
         </w:rPr>
+        <w:lastRenderedPageBreak/>
         <w:t>A database called ROLAP. The data in the OLTP database, having been standardised, is loaded into the ROLAP database in standardised form, and from there it can be accessed by Excel and a wide variety of BI applications such as Tableau, Qlik, and so on.</w:t>
       </w:r>
     </w:p>
@@ -812,8 +1010,6 @@
         </w:rPr>
         <w:t xml:space="preserve"> repository that houses the project.</w:t>
       </w:r>
-      <w:bookmarkStart w:id="0" w:name="_GoBack"/>
-      <w:bookmarkEnd w:id="0"/>
     </w:p>
     <w:sectPr>
       <w:pgSz w:w="11906" w:h="16838"/>
@@ -826,7 +1022,7 @@
 </file>
 
 <file path=word/numbering.xml><?xml version="1.0" encoding="utf-8"?>
-<w:numbering xmlns:wpc="http://schemas.microsoft.com/office/word/2010/wordprocessingCanvas" xmlns:cx="http://schemas.microsoft.com/office/drawing/2014/chartex" xmlns:cx1="http://schemas.microsoft.com/office/drawing/2015/9/8/chartex" xmlns:cx2="http://schemas.microsoft.com/office/drawing/2015/10/21/chartex" xmlns:cx3="http://schemas.microsoft.com/office/drawing/2016/5/9/chartex" xmlns:cx4="http://schemas.microsoft.com/office/drawing/2016/5/10/chartex" xmlns:cx5="http://schemas.microsoft.com/office/drawing/2016/5/11/chartex" xmlns:cx6="http://schemas.microsoft.com/office/drawing/2016/5/12/chartex" xmlns:cx7="http://schemas.microsoft.com/office/drawing/2016/5/13/chartex" xmlns:cx8="http://schemas.microsoft.com/office/drawing/2016/5/14/chartex" xmlns:mc="http://schemas.openxmlformats.org/markup-compatibility/2006" xmlns:aink="http://schemas.microsoft.com/office/drawing/2016/ink" xmlns:am3d="http://schemas.microsoft.com/office/drawing/2017/model3d" xmlns:o="urn:schemas-microsoft-com:office:office" xmlns:r="http://schemas.openxmlformats.org/officeDocument/2006/relationships" xmlns:m="http://schemas.openxmlformats.org/officeDocument/2006/math" xmlns:v="urn:schemas-microsoft-com:vml" xmlns:wp14="http://schemas.microsoft.com/office/word/2010/wordprocessingDrawing" xmlns:wp="http://schemas.openxmlformats.org/drawingml/2006/wordprocessingDrawing" xmlns:w10="urn:schemas-microsoft-com:office:word" xmlns:w="http://schemas.openxmlformats.org/wordprocessingml/2006/main" xmlns:w14="http://schemas.microsoft.com/office/word/2010/wordml" xmlns:w15="http://schemas.microsoft.com/office/word/2012/wordml" xmlns:w16cid="http://schemas.microsoft.com/office/word/2016/wordml/cid" xmlns:w16se="http://schemas.microsoft.com/office/word/2015/wordml/symex" xmlns:wpg="http://schemas.microsoft.com/office/word/2010/wordprocessingGroup" xmlns:wpi="http://schemas.microsoft.com/office/word/2010/wordprocessingInk" xmlns:wne="http://schemas.microsoft.com/office/word/2006/wordml" xmlns:wps="http://schemas.microsoft.com/office/word/2010/wordprocessingShape" mc:Ignorable="w14 w15 w16se w16cid wp14">
+<w:numbering xmlns:wpc="http://schemas.microsoft.com/office/word/2010/wordprocessingCanvas" xmlns:cx="http://schemas.microsoft.com/office/drawing/2014/chartex" xmlns:cx1="http://schemas.microsoft.com/office/drawing/2015/9/8/chartex" xmlns:mc="http://schemas.openxmlformats.org/markup-compatibility/2006" xmlns:o="urn:schemas-microsoft-com:office:office" xmlns:r="http://schemas.openxmlformats.org/officeDocument/2006/relationships" xmlns:m="http://schemas.openxmlformats.org/officeDocument/2006/math" xmlns:v="urn:schemas-microsoft-com:vml" xmlns:wp14="http://schemas.microsoft.com/office/word/2010/wordprocessingDrawing" xmlns:wp="http://schemas.openxmlformats.org/drawingml/2006/wordprocessingDrawing" xmlns:w10="urn:schemas-microsoft-com:office:word" xmlns:w="http://schemas.openxmlformats.org/wordprocessingml/2006/main" xmlns:w14="http://schemas.microsoft.com/office/word/2010/wordml" xmlns:w15="http://schemas.microsoft.com/office/word/2012/wordml" xmlns:w16se="http://schemas.microsoft.com/office/word/2015/wordml/symex" xmlns:wpg="http://schemas.microsoft.com/office/word/2010/wordprocessingGroup" xmlns:wpi="http://schemas.microsoft.com/office/word/2010/wordprocessingInk" xmlns:wne="http://schemas.microsoft.com/office/word/2006/wordml" xmlns:wps="http://schemas.microsoft.com/office/word/2010/wordprocessingShape" mc:Ignorable="w14 w15 w16se wp14">
   <w:abstractNum w:abstractNumId="0" w15:restartNumberingAfterBreak="0">
     <w:nsid w:val="19DA666E"/>
     <w:multiLevelType w:val="hybridMultilevel"/>
@@ -1091,6 +1287,95 @@
       <w:lvlJc w:val="right"/>
       <w:pPr>
         <w:ind w:left="6120" w:hanging="180"/>
+      </w:pPr>
+    </w:lvl>
+  </w:abstractNum>
+  <w:abstractNum w:abstractNumId="3" w15:restartNumberingAfterBreak="0">
+    <w:nsid w:val="53FC2B68"/>
+    <w:multiLevelType w:val="hybridMultilevel"/>
+    <w:tmpl w:val="12EA00EA"/>
+    <w:lvl w:ilvl="0" w:tplc="1009000F">
+      <w:start w:val="1"/>
+      <w:numFmt w:val="decimal"/>
+      <w:lvlText w:val="%1."/>
+      <w:lvlJc w:val="left"/>
+      <w:pPr>
+        <w:ind w:left="720" w:hanging="360"/>
+      </w:pPr>
+      <w:rPr>
+        <w:rFonts w:hint="default"/>
+      </w:rPr>
+    </w:lvl>
+    <w:lvl w:ilvl="1" w:tplc="10090019">
+      <w:start w:val="1"/>
+      <w:numFmt w:val="lowerLetter"/>
+      <w:lvlText w:val="%2."/>
+      <w:lvlJc w:val="left"/>
+      <w:pPr>
+        <w:ind w:left="1440" w:hanging="360"/>
+      </w:pPr>
+    </w:lvl>
+    <w:lvl w:ilvl="2" w:tplc="1009001B" w:tentative="1">
+      <w:start w:val="1"/>
+      <w:numFmt w:val="lowerRoman"/>
+      <w:lvlText w:val="%3."/>
+      <w:lvlJc w:val="right"/>
+      <w:pPr>
+        <w:ind w:left="2160" w:hanging="180"/>
+      </w:pPr>
+    </w:lvl>
+    <w:lvl w:ilvl="3" w:tplc="1009000F" w:tentative="1">
+      <w:start w:val="1"/>
+      <w:numFmt w:val="decimal"/>
+      <w:lvlText w:val="%4."/>
+      <w:lvlJc w:val="left"/>
+      <w:pPr>
+        <w:ind w:left="2880" w:hanging="360"/>
+      </w:pPr>
+    </w:lvl>
+    <w:lvl w:ilvl="4" w:tplc="10090019" w:tentative="1">
+      <w:start w:val="1"/>
+      <w:numFmt w:val="lowerLetter"/>
+      <w:lvlText w:val="%5."/>
+      <w:lvlJc w:val="left"/>
+      <w:pPr>
+        <w:ind w:left="3600" w:hanging="360"/>
+      </w:pPr>
+    </w:lvl>
+    <w:lvl w:ilvl="5" w:tplc="1009001B" w:tentative="1">
+      <w:start w:val="1"/>
+      <w:numFmt w:val="lowerRoman"/>
+      <w:lvlText w:val="%6."/>
+      <w:lvlJc w:val="right"/>
+      <w:pPr>
+        <w:ind w:left="4320" w:hanging="180"/>
+      </w:pPr>
+    </w:lvl>
+    <w:lvl w:ilvl="6" w:tplc="1009000F" w:tentative="1">
+      <w:start w:val="1"/>
+      <w:numFmt w:val="decimal"/>
+      <w:lvlText w:val="%7."/>
+      <w:lvlJc w:val="left"/>
+      <w:pPr>
+        <w:ind w:left="5040" w:hanging="360"/>
+      </w:pPr>
+    </w:lvl>
+    <w:lvl w:ilvl="7" w:tplc="10090019" w:tentative="1">
+      <w:start w:val="1"/>
+      <w:numFmt w:val="lowerLetter"/>
+      <w:lvlText w:val="%8."/>
+      <w:lvlJc w:val="left"/>
+      <w:pPr>
+        <w:ind w:left="5760" w:hanging="360"/>
+      </w:pPr>
+    </w:lvl>
+    <w:lvl w:ilvl="8" w:tplc="1009001B" w:tentative="1">
+      <w:start w:val="1"/>
+      <w:numFmt w:val="lowerRoman"/>
+      <w:lvlText w:val="%9."/>
+      <w:lvlJc w:val="right"/>
+      <w:pPr>
+        <w:ind w:left="6480" w:hanging="180"/>
       </w:pPr>
     </w:lvl>
   </w:abstractNum>
@@ -1103,11 +1388,14 @@
   <w:num w:numId="3">
     <w:abstractNumId w:val="1"/>
   </w:num>
+  <w:num w:numId="4">
+    <w:abstractNumId w:val="3"/>
+  </w:num>
 </w:numbering>
 </file>
 
 <file path=word/styles.xml><?xml version="1.0" encoding="utf-8"?>
-<w:styles xmlns:mc="http://schemas.openxmlformats.org/markup-compatibility/2006" xmlns:r="http://schemas.openxmlformats.org/officeDocument/2006/relationships" xmlns:w="http://schemas.openxmlformats.org/wordprocessingml/2006/main" xmlns:w14="http://schemas.microsoft.com/office/word/2010/wordml" xmlns:w15="http://schemas.microsoft.com/office/word/2012/wordml" xmlns:w16cid="http://schemas.microsoft.com/office/word/2016/wordml/cid" xmlns:w16se="http://schemas.microsoft.com/office/word/2015/wordml/symex" mc:Ignorable="w14 w15 w16se w16cid">
+<w:styles xmlns:mc="http://schemas.openxmlformats.org/markup-compatibility/2006" xmlns:r="http://schemas.openxmlformats.org/officeDocument/2006/relationships" xmlns:w="http://schemas.openxmlformats.org/wordprocessingml/2006/main" xmlns:w14="http://schemas.microsoft.com/office/word/2010/wordml" xmlns:w15="http://schemas.microsoft.com/office/word/2012/wordml" xmlns:w16se="http://schemas.microsoft.com/office/word/2015/wordml/symex" mc:Ignorable="w14 w15 w16se">
   <w:docDefaults>
     <w:rPrDefault>
       <w:rPr>
@@ -1123,7 +1411,7 @@
       </w:pPr>
     </w:pPrDefault>
   </w:docDefaults>
-  <w:latentStyles w:defLockedState="0" w:defUIPriority="99" w:defSemiHidden="0" w:defUnhideWhenUsed="0" w:defQFormat="0" w:count="375">
+  <w:latentStyles w:defLockedState="0" w:defUIPriority="99" w:defSemiHidden="0" w:defUnhideWhenUsed="0" w:defQFormat="0" w:count="371">
     <w:lsdException w:name="Normal" w:uiPriority="0" w:qFormat="1"/>
     <w:lsdException w:name="heading 1" w:uiPriority="9" w:qFormat="1"/>
     <w:lsdException w:name="heading 2" w:semiHidden="1" w:uiPriority="9" w:unhideWhenUsed="1" w:qFormat="1"/>
@@ -1495,10 +1783,6 @@
     <w:lsdException w:name="List Table 5 Dark Accent 6" w:uiPriority="50"/>
     <w:lsdException w:name="List Table 6 Colorful Accent 6" w:uiPriority="51"/>
     <w:lsdException w:name="List Table 7 Colorful Accent 6" w:uiPriority="52"/>
-    <w:lsdException w:name="Mention" w:semiHidden="1" w:unhideWhenUsed="1"/>
-    <w:lsdException w:name="Smart Hyperlink" w:semiHidden="1" w:unhideWhenUsed="1"/>
-    <w:lsdException w:name="Hashtag" w:semiHidden="1" w:unhideWhenUsed="1"/>
-    <w:lsdException w:name="Unresolved Mention" w:semiHidden="1" w:unhideWhenUsed="1"/>
   </w:latentStyles>
   <w:style w:type="paragraph" w:default="1" w:styleId="Normal">
     <w:name w:val="Normal"/>

</xml_diff>